<commit_message>
feat(v2.0): implement multi-clip batch queue, sequential timeline stitching, FCPXML kinetic karaoke subtitles, and B-roll preservation
</commit_message>
<xml_diff>
--- a/docs/SRS_ResolveFlow_Assistant.docx
+++ b/docs/SRS_ResolveFlow_Assistant.docx
@@ -5,7 +5,6 @@
     <w:p>
       <w:pPr>
         <w:pStyle w:val="Title"/>
-        <w:jc w:val="both"/>
       </w:pPr>
       <w:r>
         <w:rPr>
@@ -17,7 +16,7 @@
     <w:p>
       <w:pPr>
         <w:spacing w:after="480"/>
-        <w:jc w:val="both"/>
+        <w:jc w:val="center"/>
       </w:pPr>
       <w:r>
         <w:rPr>
@@ -213,7 +212,7 @@
           <w:p>
             <w:pPr>
               <w:spacing w:before="40" w:after="40"/>
-              <w:jc w:val="both"/>
+              <w:jc w:val="center"/>
               <w:cnfStyle w:val="000000100000" w:firstRow="0" w:lastRow="0" w:firstColumn="0" w:lastColumn="0" w:oddVBand="0" w:evenVBand="0" w:oddHBand="1" w:evenHBand="0" w:firstRowFirstColumn="0" w:firstRowLastColumn="0" w:lastRowFirstColumn="0" w:lastRowLastColumn="0"/>
             </w:pPr>
             <w:r>
@@ -250,7 +249,7 @@
     <w:p>
       <w:pPr>
         <w:pStyle w:val="Heading1"/>
-        <w:jc w:val="both"/>
+        <w:jc w:val="center"/>
       </w:pPr>
       <w:bookmarkStart w:id="3" w:name="_Toc238477330"/>
       <w:r>
@@ -260,6 +259,14 @@
     </w:p>
     <w:sdt>
       <w:sdtPr>
+        <w:rPr>
+          <w:rFonts w:ascii="Arial" w:eastAsiaTheme="minorEastAsia" w:hAnsi="Arial" w:cstheme="minorBidi"/>
+          <w:b w:val="0"/>
+          <w:bCs w:val="0"/>
+          <w:color w:val="333333"/>
+          <w:sz w:val="22"/>
+          <w:szCs w:val="22"/>
+        </w:rPr>
         <w:id w:val="1436946088"/>
         <w:docPartObj>
           <w:docPartGallery w:val="Table of Contents"/>
@@ -268,11 +275,7 @@
       </w:sdtPr>
       <w:sdtEndPr>
         <w:rPr>
-          <w:rFonts w:ascii="Arial" w:eastAsiaTheme="minorEastAsia" w:hAnsi="Arial" w:cstheme="minorBidi"/>
           <w:noProof/>
-          <w:color w:val="333333"/>
-          <w:sz w:val="22"/>
-          <w:szCs w:val="22"/>
         </w:rPr>
       </w:sdtEndPr>
       <w:sdtContent>
@@ -587,7 +590,21 @@
                 <w:rStyle w:val="Hyperlink"/>
                 <w:noProof/>
               </w:rPr>
-              <w:t>1. GIỚI THIỆU (INTRODUCTION)</w:t>
+              <w:t>1. GIỚI THIỆU (I</w:t>
+            </w:r>
+            <w:r>
+              <w:rPr>
+                <w:rStyle w:val="Hyperlink"/>
+                <w:noProof/>
+              </w:rPr>
+              <w:t>N</w:t>
+            </w:r>
+            <w:r>
+              <w:rPr>
+                <w:rStyle w:val="Hyperlink"/>
+                <w:noProof/>
+              </w:rPr>
+              <w:t>TRODUCTION)</w:t>
             </w:r>
             <w:r>
               <w:rPr>
@@ -4077,16 +4094,13 @@
         <w:jc w:val="both"/>
       </w:pPr>
       <w:r>
-        <w:t xml:space="preserve">Tài liệu SRS này nhằm xác định chi tiết các yêu cầu nghiệp vụ, chức năng, phi chức năng và thiết kế kiến trúc hệ thống cho công cụ </w:t>
-      </w:r>
-      <w:r>
-        <w:rPr>
-          <w:b/>
-        </w:rPr>
-        <w:t>ResolveFlow Assistant</w:t>
-      </w:r>
-      <w:r>
-        <w:t>. Tài liệu này đóng vai trò là kim chỉ nam cho quá trình phát triển mã nguồn, xây dựng các kịch bản kiểm thử (tests) và làm cơ sở thống nhất nghiệm thu kỹ thuật.</w:t>
+        <w:t xml:space="preserve">Tài liệu SRS này nhằm xác định chi tiết các yêu cầu nghiệp vụ, chức năng, phi chức năng và thiết kế kiến trúc hệ thống cho công </w:t>
+      </w:r>
+      <w:r>
+        <w:t>cụ ResolveFlow Assistant.</w:t>
+      </w:r>
+      <w:r>
+        <w:t xml:space="preserve"> Tài liệu này đóng vai trò là kim chỉ nam cho quá trình phát triển mã nguồn, xây dựng các kịch bản kiểm thử (tests) và làm cơ sở thống nhất nghiệm thu kỹ thuật.</w:t>
       </w:r>
     </w:p>
     <w:p>
@@ -4122,13 +4136,7 @@
         <w:jc w:val="both"/>
       </w:pPr>
       <w:r>
-        <w:t xml:space="preserve">ResolveFlow Assistant là một phần mềm hỗ trợ tự động hóa (Desktop Automation Suite) chạy độc lập hoặc tích hợp trực tiếp vào DaVinci Resolve để giải quyết bài toán tốn thời gian nhất trong hậu kỳ: </w:t>
-      </w:r>
-      <w:r>
-        <w:rPr>
-          <w:b/>
-        </w:rPr>
-        <w:t>Transcribe giọng nói thành văn bản, tự động chèn phụ đề đồng bộ, và tự động cắt bỏ các đoạn im lặng/lỗi phát âm.</w:t>
+        <w:t>ResolveFlow Assistant là một phần mềm hỗ trợ tự động hóa (Desktop Automation Suite) chạy độc lập hoặc tích hợp trực tiếp vào DaVinci Resolve để giải quyết bài toán tốn thời gian nhất trong hậu kỳ: Transcribe giọng nói thành văn bản, tự động chèn phụ đề đồng bộ, và tự động cắt bỏ các đoạn im lặng/lỗi phát âm.</w:t>
       </w:r>
     </w:p>
     <w:p>
@@ -4289,10 +4297,13 @@
         <w:spacing w:after="80"/>
         <w:ind w:left="1350"/>
         <w:jc w:val="both"/>
-      </w:pPr>
-      <w:r>
         <w:rPr>
-          <w:b/>
+          <w:bCs/>
+        </w:rPr>
+      </w:pPr>
+      <w:r>
+        <w:rPr>
+          <w:bCs/>
         </w:rPr>
         <w:t>Những gì hệ thống SẼ KHÔNG làm:</w:t>
       </w:r>
@@ -4463,7 +4474,6 @@
               <w:jc w:val="both"/>
             </w:pPr>
             <w:r>
-              <w:lastRenderedPageBreak/>
               <w:t>Local / On-Premise</w:t>
             </w:r>
           </w:p>
@@ -4479,7 +4489,11 @@
               <w:cnfStyle w:val="000000100000" w:firstRow="0" w:lastRow="0" w:firstColumn="0" w:lastColumn="0" w:oddVBand="0" w:evenVBand="0" w:oddHBand="1" w:evenHBand="0" w:firstRowFirstColumn="0" w:firstRowLastColumn="0" w:lastRowFirstColumn="0" w:lastRowLastColumn="0"/>
             </w:pPr>
             <w:r>
-              <w:t>Vận hành hoàn toàn cục bộ trên máy tính của người dùng, không phụ thuộc máy chủ từ xa.</w:t>
+              <w:t xml:space="preserve">Vận hành hoàn toàn cục bộ trên máy tính </w:t>
+            </w:r>
+            <w:r>
+              <w:lastRenderedPageBreak/>
+              <w:t>của người dùng, không phụ thuộc máy chủ từ xa.</w:t>
             </w:r>
           </w:p>
         </w:tc>
@@ -4496,6 +4510,7 @@
               <w:jc w:val="both"/>
             </w:pPr>
             <w:r>
+              <w:lastRenderedPageBreak/>
               <w:t>CUDA</w:t>
             </w:r>
           </w:p>
@@ -4794,14 +4809,6 @@
                 <w:sz w:val="19"/>
               </w:rPr>
               <w:br/>
-            </w:r>
-            <w:r>
-              <w:rPr>
-                <w:rFonts w:ascii="Courier New" w:hAnsi="Courier New"/>
-                <w:color w:val="212121"/>
-                <w:sz w:val="19"/>
-              </w:rPr>
-              <w:lastRenderedPageBreak/>
               <w:t xml:space="preserve">    E --&gt;|Write Scripts / EDL| A</w:t>
             </w:r>
           </w:p>
@@ -4819,6 +4826,7 @@
         <w:jc w:val="both"/>
       </w:pPr>
       <w:r>
+        <w:lastRenderedPageBreak/>
         <w:t>Hệ thống tận dụng tối đa kiến trúc phần cứng cục bộ, đặc biệt là nhân Tensor trên GPU NVIDIA để chạy các mạng nơ-ron xử lý ngôn ngữ tự nhiên ngoại tuyến.</w:t>
       </w:r>
     </w:p>
@@ -5206,26 +5214,42 @@
     <w:p>
       <w:pPr>
         <w:jc w:val="both"/>
-      </w:pPr>
-      <w:r>
+        <w:rPr>
+          <w:lang w:val="vi-VN"/>
+        </w:rPr>
+      </w:pPr>
+      <w:r>
+        <w:rPr>
+          <w:lang w:val="vi-VN"/>
+        </w:rPr>
         <w:t>4. Tạo và Vẽ Phụ đề Tự động (Auto Subtitle Burn-In/Generate): Sử dụng scripting để chèn đối tượng Text+ vào đúng track phụ đề trên Timeline đang hoạt động.</w:t>
       </w:r>
     </w:p>
     <w:p>
       <w:pPr>
         <w:jc w:val="both"/>
-      </w:pPr>
-      <w:r>
+        <w:rPr>
+          <w:lang w:val="vi-VN"/>
+        </w:rPr>
+      </w:pPr>
+      <w:r>
+        <w:rPr>
+          <w:lang w:val="vi-VN"/>
+        </w:rPr>
         <w:t xml:space="preserve">5. Cắt dựng thông minh (Silent Removal &amp; Outtakes Cut): Phân tích âm lượng sóng âm kết hợp văn bản dịch để tìm các đoạn "e... à..." hoặc im lặng dài hơn </w:t>
       </w:r>
       <w:r>
         <w:rPr>
           <w:rFonts w:ascii="Courier New" w:hAnsi="Courier New"/>
           <w:color w:val="C7254E"/>
+          <w:lang w:val="vi-VN"/>
         </w:rPr>
         <w:t>X</w:t>
       </w:r>
       <w:r>
+        <w:rPr>
+          <w:lang w:val="vi-VN"/>
+        </w:rPr>
         <w:t xml:space="preserve"> giây và tự động cắt bỏ chúng trên Timeline.</w:t>
       </w:r>
     </w:p>
@@ -5369,7 +5393,6 @@
         <w:jc w:val="both"/>
       </w:pPr>
       <w:r>
-        <w:lastRenderedPageBreak/>
         <w:t xml:space="preserve">Phụ thuộc vào tính sẵn có của tệp thực thi </w:t>
       </w:r>
       <w:r>
@@ -5410,6 +5433,7 @@
       </w:pPr>
       <w:bookmarkStart w:id="16" w:name="_Toc238477343"/>
       <w:r>
+        <w:lastRenderedPageBreak/>
         <w:t>3. YÊU CẦU CHI TIẾT (SPECIFIC REQUIREMENTS)</w:t>
       </w:r>
       <w:bookmarkEnd w:id="16"/>
@@ -5773,7 +5797,6 @@
         <w:jc w:val="both"/>
       </w:pPr>
       <w:r>
-        <w:lastRenderedPageBreak/>
         <w:t xml:space="preserve">2. Hệ thống gọi FFmpeg trích xuất âm thanh sang định dạng </w:t>
       </w:r>
       <w:r>
@@ -5800,6 +5823,7 @@
         <w:jc w:val="both"/>
       </w:pPr>
       <w:r>
+        <w:lastRenderedPageBreak/>
         <w:t>4. Thực hiện chia nhỏ file âm thanh và chạy mô hình STT.</w:t>
       </w:r>
     </w:p>
@@ -6550,7 +6574,31 @@
         <w:jc w:val="both"/>
       </w:pPr>
       <w:r>
-        <w:t xml:space="preserve">Dưới đây là bảng ma trận truy vết yêu cầu (Traceability Matrix) giúp theo dõi tiến độ triển khai các yêu cầu nghiệp vụ từ phía Video Editor thành mã nguồn </w:t>
+        <w:t xml:space="preserve">Dưới đây là bảng ma trận truy vết yêu cầu (Traceability Matrix) giúp theo dõi tiến độ triển khai các yêu cầu nghiệp vụ từ phía Video Editor </w:t>
+      </w:r>
+      <w:proofErr w:type="spellStart"/>
+      <w:r>
+        <w:t>thành</w:t>
+      </w:r>
+      <w:proofErr w:type="spellEnd"/>
+      <w:r>
+        <w:t xml:space="preserve"> </w:t>
+      </w:r>
+      <w:proofErr w:type="spellStart"/>
+      <w:r>
+        <w:t>mã</w:t>
+      </w:r>
+      <w:proofErr w:type="spellEnd"/>
+      <w:r>
+        <w:t xml:space="preserve"> </w:t>
+      </w:r>
+      <w:proofErr w:type="spellStart"/>
+      <w:r>
+        <w:t>nguồn</w:t>
+      </w:r>
+      <w:proofErr w:type="spellEnd"/>
+      <w:r>
+        <w:t xml:space="preserve"> </w:t>
       </w:r>
       <w:proofErr w:type="spellStart"/>
       <w:r>
@@ -7040,7 +7088,21 @@
         <w:rPr>
           <w:b/>
         </w:rPr>
-        <w:t xml:space="preserve">Công nghệ </w:t>
+        <w:t xml:space="preserve">Công </w:t>
+      </w:r>
+      <w:proofErr w:type="spellStart"/>
+      <w:r>
+        <w:rPr>
+          <w:b/>
+        </w:rPr>
+        <w:t>nghệ</w:t>
+      </w:r>
+      <w:proofErr w:type="spellEnd"/>
+      <w:r>
+        <w:rPr>
+          <w:b/>
+        </w:rPr>
+        <w:t xml:space="preserve"> </w:t>
       </w:r>
       <w:proofErr w:type="spellStart"/>
       <w:r>
@@ -7174,7 +7236,49 @@
         <w:rPr>
           <w:i/>
         </w:rPr>
-        <w:t xml:space="preserve">Hình 2: Sơ đồ tuần tự xử lý tác </w:t>
+        <w:t xml:space="preserve">Hình 2: Sơ đồ tuần tự </w:t>
+      </w:r>
+      <w:proofErr w:type="spellStart"/>
+      <w:r>
+        <w:rPr>
+          <w:i/>
+        </w:rPr>
+        <w:t>xử</w:t>
+      </w:r>
+      <w:proofErr w:type="spellEnd"/>
+      <w:r>
+        <w:rPr>
+          <w:i/>
+        </w:rPr>
+        <w:t xml:space="preserve"> </w:t>
+      </w:r>
+      <w:proofErr w:type="spellStart"/>
+      <w:r>
+        <w:rPr>
+          <w:i/>
+        </w:rPr>
+        <w:t>lý</w:t>
+      </w:r>
+      <w:proofErr w:type="spellEnd"/>
+      <w:r>
+        <w:rPr>
+          <w:i/>
+        </w:rPr>
+        <w:t xml:space="preserve"> </w:t>
+      </w:r>
+      <w:proofErr w:type="spellStart"/>
+      <w:r>
+        <w:rPr>
+          <w:i/>
+        </w:rPr>
+        <w:t>tác</w:t>
+      </w:r>
+      <w:proofErr w:type="spellEnd"/>
+      <w:r>
+        <w:rPr>
+          <w:i/>
+        </w:rPr>
+        <w:t xml:space="preserve"> </w:t>
       </w:r>
       <w:proofErr w:type="spellStart"/>
       <w:r>

</xml_diff>